<commit_message>
Melhorias: Ajustes de layout dos grÃ¡ficos e correÃ§Ãµes de validaÃ§Ã£o - Ajustes de layout dos grÃ¡ficos (Wizard e PRO): linhas mais finas, pontos menores, transparÃªncia reduzida, legenda com linhas - CorreÃ§Ãµes de validaÃ§Ã£o (Dose 6): proteÃ§Ã£o contra NaN, uso consistente de formatarValorMonetario - Melhorias de UX (Dose 7): texto explicativo melhorado no modal de renda mensal - DocumentaÃ§Ã£o: ANALISE_INCONSISTENCIAS_WIZARD.md
</commit_message>
<xml_diff>
--- a/docs/GUIA COMPLETO_Simulador_Aposentadoria_V2.docx
+++ b/docs/GUIA COMPLETO_Simulador_Aposentadoria_V2.docx
@@ -51,7 +51,7 @@
       </w:pPr>
       <w:r>
         <w:pict w14:anchorId="4E300019">
-          <v:rect id="_x0000_i1361" style="width:0;height:1.5pt" o:hralign="center" o:hrstd="t" o:hr="t" fillcolor="#a0a0a0" stroked="f"/>
+          <v:rect id="_x0000_i1025" style="width:0;height:1.5pt" o:hralign="center" o:hrstd="t" o:hr="t" fillcolor="#a0a0a0" stroked="f"/>
         </w:pict>
       </w:r>
     </w:p>
@@ -224,7 +224,7 @@
       </w:pPr>
       <w:r>
         <w:pict w14:anchorId="2280A270">
-          <v:rect id="_x0000_i1362" style="width:0;height:1.5pt" o:hralign="center" o:hrstd="t" o:hr="t" fillcolor="#a0a0a0" stroked="f"/>
+          <v:rect id="_x0000_i1026" style="width:0;height:1.5pt" o:hralign="center" o:hrstd="t" o:hr="t" fillcolor="#a0a0a0" stroked="f"/>
         </w:pict>
       </w:r>
     </w:p>
@@ -414,7 +414,7 @@
       </w:pPr>
       <w:r>
         <w:pict w14:anchorId="3BE476FB">
-          <v:rect id="_x0000_i1363" style="width:0;height:1.5pt" o:hralign="center" o:hrstd="t" o:hr="t" fillcolor="#a0a0a0" stroked="f"/>
+          <v:rect id="_x0000_i1027" style="width:0;height:1.5pt" o:hralign="center" o:hrstd="t" o:hr="t" fillcolor="#a0a0a0" stroked="f"/>
         </w:pict>
       </w:r>
     </w:p>
@@ -940,7 +940,7 @@
       </w:pPr>
       <w:r>
         <w:pict w14:anchorId="46B56249">
-          <v:rect id="_x0000_i1364" style="width:0;height:1.5pt" o:hralign="center" o:hrstd="t" o:hr="t" fillcolor="#a0a0a0" stroked="f"/>
+          <v:rect id="_x0000_i1028" style="width:0;height:1.5pt" o:hralign="center" o:hrstd="t" o:hr="t" fillcolor="#a0a0a0" stroked="f"/>
         </w:pict>
       </w:r>
     </w:p>
@@ -1260,7 +1260,7 @@
       </w:pPr>
       <w:r>
         <w:pict w14:anchorId="378861F6">
-          <v:rect id="_x0000_i1365" style="width:0;height:1.5pt" o:hralign="center" o:hrstd="t" o:hr="t" fillcolor="#a0a0a0" stroked="f"/>
+          <v:rect id="_x0000_i1029" style="width:0;height:1.5pt" o:hralign="center" o:hrstd="t" o:hr="t" fillcolor="#a0a0a0" stroked="f"/>
         </w:pict>
       </w:r>
     </w:p>
@@ -1315,7 +1315,7 @@
       </w:pPr>
       <w:r>
         <w:pict w14:anchorId="0622F33C">
-          <v:rect id="_x0000_i1366" style="width:0;height:1.5pt" o:hralign="center" o:hrstd="t" o:hr="t" fillcolor="#a0a0a0" stroked="f"/>
+          <v:rect id="_x0000_i1030" style="width:0;height:1.5pt" o:hralign="center" o:hrstd="t" o:hr="t" fillcolor="#a0a0a0" stroked="f"/>
         </w:pict>
       </w:r>
     </w:p>
@@ -1667,7 +1667,7 @@
       </w:pPr>
       <w:r>
         <w:pict w14:anchorId="05DA089C">
-          <v:rect id="_x0000_i1367" style="width:0;height:1.5pt" o:hralign="center" o:hrstd="t" o:hr="t" fillcolor="#a0a0a0" stroked="f"/>
+          <v:rect id="_x0000_i1031" style="width:0;height:1.5pt" o:hralign="center" o:hrstd="t" o:hr="t" fillcolor="#a0a0a0" stroked="f"/>
         </w:pict>
       </w:r>
     </w:p>
@@ -2037,7 +2037,7 @@
       </w:pPr>
       <w:r>
         <w:pict w14:anchorId="18890AE9">
-          <v:rect id="_x0000_i1368" style="width:0;height:1.5pt" o:hralign="center" o:hrstd="t" o:hr="t" fillcolor="#a0a0a0" stroked="f"/>
+          <v:rect id="_x0000_i1032" style="width:0;height:1.5pt" o:hralign="center" o:hrstd="t" o:hr="t" fillcolor="#a0a0a0" stroked="f"/>
         </w:pict>
       </w:r>
     </w:p>
@@ -2446,7 +2446,7 @@
       </w:pPr>
       <w:r>
         <w:pict w14:anchorId="5C7455FF">
-          <v:rect id="_x0000_i1369" style="width:0;height:1.5pt" o:hralign="center" o:hrstd="t" o:hr="t" fillcolor="#a0a0a0" stroked="f"/>
+          <v:rect id="_x0000_i1033" style="width:0;height:1.5pt" o:hralign="center" o:hrstd="t" o:hr="t" fillcolor="#a0a0a0" stroked="f"/>
         </w:pict>
       </w:r>
     </w:p>
@@ -2655,7 +2655,7 @@
       </w:pPr>
       <w:r>
         <w:pict w14:anchorId="7614112B">
-          <v:rect id="_x0000_i1370" style="width:0;height:1.5pt" o:hralign="center" o:hrstd="t" o:hr="t" fillcolor="#a0a0a0" stroked="f"/>
+          <v:rect id="_x0000_i1034" style="width:0;height:1.5pt" o:hralign="center" o:hrstd="t" o:hr="t" fillcolor="#a0a0a0" stroked="f"/>
         </w:pict>
       </w:r>
     </w:p>
@@ -2800,7 +2800,7 @@
       </w:pPr>
       <w:r>
         <w:pict w14:anchorId="7AE39049">
-          <v:rect id="_x0000_i1371" style="width:0;height:1.5pt" o:hralign="center" o:hrstd="t" o:hr="t" fillcolor="#a0a0a0" stroked="f"/>
+          <v:rect id="_x0000_i1035" style="width:0;height:1.5pt" o:hralign="center" o:hrstd="t" o:hr="t" fillcolor="#a0a0a0" stroked="f"/>
         </w:pict>
       </w:r>
     </w:p>
@@ -2921,7 +2921,7 @@
       </w:pPr>
       <w:r>
         <w:pict w14:anchorId="07232F7E">
-          <v:rect id="_x0000_i1372" style="width:0;height:1.5pt" o:hralign="center" o:hrstd="t" o:hr="t" fillcolor="#a0a0a0" stroked="f"/>
+          <v:rect id="_x0000_i1036" style="width:0;height:1.5pt" o:hralign="center" o:hrstd="t" o:hr="t" fillcolor="#a0a0a0" stroked="f"/>
         </w:pict>
       </w:r>
     </w:p>
@@ -3043,7 +3043,7 @@
       <w:r>
         <w:lastRenderedPageBreak/>
         <w:pict w14:anchorId="6BE1A8B2">
-          <v:rect id="_x0000_i1373" style="width:0;height:1.5pt" o:hralign="center" o:hrstd="t" o:hr="t" fillcolor="#a0a0a0" stroked="f"/>
+          <v:rect id="_x0000_i1037" style="width:0;height:1.5pt" o:hralign="center" o:hrstd="t" o:hr="t" fillcolor="#a0a0a0" stroked="f"/>
         </w:pict>
       </w:r>
     </w:p>
@@ -3458,7 +3458,7 @@
       </w:pPr>
       <w:r>
         <w:pict w14:anchorId="4B11B025">
-          <v:rect id="_x0000_i1374" style="width:0;height:1.5pt" o:hralign="center" o:hrstd="t" o:hr="t" fillcolor="#a0a0a0" stroked="f"/>
+          <v:rect id="_x0000_i1038" style="width:0;height:1.5pt" o:hralign="center" o:hrstd="t" o:hr="t" fillcolor="#a0a0a0" stroked="f"/>
         </w:pict>
       </w:r>
     </w:p>
@@ -3652,7 +3652,7 @@
       </w:pPr>
       <w:r>
         <w:pict w14:anchorId="009F6279">
-          <v:rect id="_x0000_i1375" style="width:0;height:1.5pt" o:hralign="center" o:hrstd="t" o:hr="t" fillcolor="#a0a0a0" stroked="f"/>
+          <v:rect id="_x0000_i1039" style="width:0;height:1.5pt" o:hralign="center" o:hrstd="t" o:hr="t" fillcolor="#a0a0a0" stroked="f"/>
         </w:pict>
       </w:r>
     </w:p>
@@ -3811,7 +3811,7 @@
       <w:r>
         <w:lastRenderedPageBreak/>
         <w:pict w14:anchorId="7D916610">
-          <v:rect id="_x0000_i1376" style="width:0;height:1.5pt" o:hralign="center" o:hrstd="t" o:hr="t" fillcolor="#a0a0a0" stroked="f"/>
+          <v:rect id="_x0000_i1040" style="width:0;height:1.5pt" o:hralign="center" o:hrstd="t" o:hr="t" fillcolor="#a0a0a0" stroked="f"/>
         </w:pict>
       </w:r>
     </w:p>
@@ -3957,7 +3957,7 @@
       </w:pPr>
       <w:r>
         <w:pict w14:anchorId="4E05772A">
-          <v:rect id="_x0000_i1377" style="width:0;height:1.5pt" o:hralign="center" o:hrstd="t" o:hr="t" fillcolor="#a0a0a0" stroked="f"/>
+          <v:rect id="_x0000_i1041" style="width:0;height:1.5pt" o:hralign="center" o:hrstd="t" o:hr="t" fillcolor="#a0a0a0" stroked="f"/>
         </w:pict>
       </w:r>
     </w:p>
@@ -4102,7 +4102,7 @@
       </w:pPr>
       <w:r>
         <w:pict w14:anchorId="42B9554F">
-          <v:rect id="_x0000_i1378" style="width:0;height:1.5pt" o:hralign="center" o:hrstd="t" o:hr="t" fillcolor="#a0a0a0" stroked="f"/>
+          <v:rect id="_x0000_i1042" style="width:0;height:1.5pt" o:hralign="center" o:hrstd="t" o:hr="t" fillcolor="#a0a0a0" stroked="f"/>
         </w:pict>
       </w:r>
     </w:p>
@@ -4285,7 +4285,7 @@
       </w:pPr>
       <w:r>
         <w:pict w14:anchorId="5B0A8360">
-          <v:rect id="_x0000_i1379" style="width:0;height:1.5pt" o:hralign="center" o:hrstd="t" o:hr="t" fillcolor="#a0a0a0" stroked="f"/>
+          <v:rect id="_x0000_i1043" style="width:0;height:1.5pt" o:hralign="center" o:hrstd="t" o:hr="t" fillcolor="#a0a0a0" stroked="f"/>
         </w:pict>
       </w:r>
     </w:p>
@@ -4396,7 +4396,7 @@
       </w:pPr>
       <w:r>
         <w:pict w14:anchorId="3D5EE53F">
-          <v:rect id="_x0000_i1380" style="width:0;height:1.5pt" o:hralign="center" o:hrstd="t" o:hr="t" fillcolor="#a0a0a0" stroked="f"/>
+          <v:rect id="_x0000_i1044" style="width:0;height:1.5pt" o:hralign="center" o:hrstd="t" o:hr="t" fillcolor="#a0a0a0" stroked="f"/>
         </w:pict>
       </w:r>
     </w:p>
@@ -4804,7 +4804,7 @@
       </w:pPr>
       <w:r>
         <w:pict w14:anchorId="7C8D86E3">
-          <v:rect id="_x0000_i1381" style="width:0;height:1.5pt" o:hralign="center" o:hrstd="t" o:hr="t" fillcolor="#a0a0a0" stroked="f"/>
+          <v:rect id="_x0000_i1045" style="width:0;height:1.5pt" o:hralign="center" o:hrstd="t" o:hr="t" fillcolor="#a0a0a0" stroked="f"/>
         </w:pict>
       </w:r>
     </w:p>
@@ -5230,7 +5230,7 @@
       </w:pPr>
       <w:r>
         <w:pict w14:anchorId="5C7CACF9">
-          <v:rect id="_x0000_i1382" style="width:0;height:1.5pt" o:hralign="center" o:hrstd="t" o:hr="t" fillcolor="#a0a0a0" stroked="f"/>
+          <v:rect id="_x0000_i1046" style="width:0;height:1.5pt" o:hralign="center" o:hrstd="t" o:hr="t" fillcolor="#a0a0a0" stroked="f"/>
         </w:pict>
       </w:r>
     </w:p>
@@ -5619,7 +5619,7 @@
       </w:pPr>
       <w:r>
         <w:pict w14:anchorId="3604A5B3">
-          <v:rect id="_x0000_i1383" style="width:0;height:1.5pt" o:hralign="center" o:hrstd="t" o:hr="t" fillcolor="#a0a0a0" stroked="f"/>
+          <v:rect id="_x0000_i1047" style="width:0;height:1.5pt" o:hralign="center" o:hrstd="t" o:hr="t" fillcolor="#a0a0a0" stroked="f"/>
         </w:pict>
       </w:r>
     </w:p>
@@ -5995,7 +5995,7 @@
       </w:pPr>
       <w:r>
         <w:pict w14:anchorId="6B558450">
-          <v:rect id="_x0000_i1384" style="width:0;height:1.5pt" o:hralign="center" o:hrstd="t" o:hr="t" fillcolor="#a0a0a0" stroked="f"/>
+          <v:rect id="_x0000_i1048" style="width:0;height:1.5pt" o:hralign="center" o:hrstd="t" o:hr="t" fillcolor="#a0a0a0" stroked="f"/>
         </w:pict>
       </w:r>
     </w:p>
@@ -6410,7 +6410,7 @@
       </w:pPr>
       <w:r>
         <w:pict w14:anchorId="4AC1EB6C">
-          <v:rect id="_x0000_i1385" style="width:0;height:1.5pt" o:hralign="center" o:hrstd="t" o:hr="t" fillcolor="#a0a0a0" stroked="f"/>
+          <v:rect id="_x0000_i1049" style="width:0;height:1.5pt" o:hralign="center" o:hrstd="t" o:hr="t" fillcolor="#a0a0a0" stroked="f"/>
         </w:pict>
       </w:r>
     </w:p>
@@ -6491,7 +6491,7 @@
       </w:pPr>
       <w:r>
         <w:pict w14:anchorId="0C71598A">
-          <v:rect id="_x0000_i1386" style="width:0;height:1.5pt" o:hralign="center" o:hrstd="t" o:hr="t" fillcolor="#a0a0a0" stroked="f"/>
+          <v:rect id="_x0000_i1050" style="width:0;height:1.5pt" o:hralign="center" o:hrstd="t" o:hr="t" fillcolor="#a0a0a0" stroked="f"/>
         </w:pict>
       </w:r>
     </w:p>
@@ -6657,7 +6657,7 @@
       </w:pPr>
       <w:r>
         <w:pict w14:anchorId="7384CBA9">
-          <v:rect id="_x0000_i1387" style="width:0;height:1.5pt" o:hralign="center" o:hrstd="t" o:hr="t" fillcolor="#a0a0a0" stroked="f"/>
+          <v:rect id="_x0000_i1051" style="width:0;height:1.5pt" o:hralign="center" o:hrstd="t" o:hr="t" fillcolor="#a0a0a0" stroked="f"/>
         </w:pict>
       </w:r>
     </w:p>
@@ -6912,7 +6912,7 @@
       </w:pPr>
       <w:r>
         <w:pict w14:anchorId="48860C01">
-          <v:rect id="_x0000_i1388" style="width:0;height:1.5pt" o:hralign="center" o:hrstd="t" o:hr="t" fillcolor="#a0a0a0" stroked="f"/>
+          <v:rect id="_x0000_i1052" style="width:0;height:1.5pt" o:hralign="center" o:hrstd="t" o:hr="t" fillcolor="#a0a0a0" stroked="f"/>
         </w:pict>
       </w:r>
     </w:p>
@@ -7153,7 +7153,7 @@
       </w:pPr>
       <w:r>
         <w:pict w14:anchorId="598754B5">
-          <v:rect id="_x0000_i1389" style="width:0;height:1.5pt" o:hralign="center" o:hrstd="t" o:hr="t" fillcolor="#a0a0a0" stroked="f"/>
+          <v:rect id="_x0000_i1053" style="width:0;height:1.5pt" o:hralign="center" o:hrstd="t" o:hr="t" fillcolor="#a0a0a0" stroked="f"/>
         </w:pict>
       </w:r>
     </w:p>
@@ -7597,7 +7597,7 @@
       </w:pPr>
       <w:r>
         <w:pict w14:anchorId="37C9957F">
-          <v:rect id="_x0000_i1390" style="width:0;height:1.5pt" o:hralign="center" o:hrstd="t" o:hr="t" fillcolor="#a0a0a0" stroked="f"/>
+          <v:rect id="_x0000_i1054" style="width:0;height:1.5pt" o:hralign="center" o:hrstd="t" o:hr="t" fillcolor="#a0a0a0" stroked="f"/>
         </w:pict>
       </w:r>
     </w:p>
@@ -7719,7 +7719,7 @@
       </w:pPr>
       <w:r>
         <w:pict w14:anchorId="4B78F8A3">
-          <v:rect id="_x0000_i1391" style="width:0;height:1.5pt" o:hralign="center" o:hrstd="t" o:hr="t" fillcolor="#a0a0a0" stroked="f"/>
+          <v:rect id="_x0000_i1055" style="width:0;height:1.5pt" o:hralign="center" o:hrstd="t" o:hr="t" fillcolor="#a0a0a0" stroked="f"/>
         </w:pict>
       </w:r>
     </w:p>
@@ -7816,7 +7816,7 @@
       </w:pPr>
       <w:r>
         <w:pict w14:anchorId="7AE75456">
-          <v:rect id="_x0000_i1392" style="width:0;height:1.5pt" o:hralign="center" o:hrstd="t" o:hr="t" fillcolor="#a0a0a0" stroked="f"/>
+          <v:rect id="_x0000_i1056" style="width:0;height:1.5pt" o:hralign="center" o:hrstd="t" o:hr="t" fillcolor="#a0a0a0" stroked="f"/>
         </w:pict>
       </w:r>
     </w:p>
@@ -7913,7 +7913,7 @@
       </w:pPr>
       <w:r>
         <w:pict w14:anchorId="179B6041">
-          <v:rect id="_x0000_i1393" style="width:0;height:1.5pt" o:hralign="center" o:hrstd="t" o:hr="t" fillcolor="#a0a0a0" stroked="f"/>
+          <v:rect id="_x0000_i1057" style="width:0;height:1.5pt" o:hralign="center" o:hrstd="t" o:hr="t" fillcolor="#a0a0a0" stroked="f"/>
         </w:pict>
       </w:r>
     </w:p>
@@ -8016,7 +8016,7 @@
       </w:pPr>
       <w:r>
         <w:pict w14:anchorId="3EC85E94">
-          <v:rect id="_x0000_i1394" style="width:0;height:1.5pt" o:hralign="center" o:hrstd="t" o:hr="t" fillcolor="#a0a0a0" stroked="f"/>
+          <v:rect id="_x0000_i1058" style="width:0;height:1.5pt" o:hralign="center" o:hrstd="t" o:hr="t" fillcolor="#a0a0a0" stroked="f"/>
         </w:pict>
       </w:r>
     </w:p>
@@ -8321,7 +8321,7 @@
       </w:pPr>
       <w:r>
         <w:pict w14:anchorId="27E119C0">
-          <v:rect id="_x0000_i1395" style="width:0;height:1.5pt" o:hralign="center" o:hrstd="t" o:hr="t" fillcolor="#a0a0a0" stroked="f"/>
+          <v:rect id="_x0000_i1059" style="width:0;height:1.5pt" o:hralign="center" o:hrstd="t" o:hr="t" fillcolor="#a0a0a0" stroked="f"/>
         </w:pict>
       </w:r>
     </w:p>
@@ -8622,7 +8622,7 @@
       </w:pPr>
       <w:r>
         <w:pict w14:anchorId="01A5A742">
-          <v:rect id="_x0000_i1396" style="width:0;height:1.5pt" o:hralign="center" o:hrstd="t" o:hr="t" fillcolor="#a0a0a0" stroked="f"/>
+          <v:rect id="_x0000_i1060" style="width:0;height:1.5pt" o:hralign="center" o:hrstd="t" o:hr="t" fillcolor="#a0a0a0" stroked="f"/>
         </w:pict>
       </w:r>
     </w:p>
@@ -8821,7 +8821,7 @@
       <w:r>
         <w:lastRenderedPageBreak/>
         <w:pict w14:anchorId="4B0E2D8C">
-          <v:rect id="_x0000_i1397" style="width:0;height:1.5pt" o:hralign="center" o:hrstd="t" o:hr="t" fillcolor="#a0a0a0" stroked="f"/>
+          <v:rect id="_x0000_i1061" style="width:0;height:1.5pt" o:hralign="center" o:hrstd="t" o:hr="t" fillcolor="#a0a0a0" stroked="f"/>
         </w:pict>
       </w:r>
     </w:p>
@@ -9266,7 +9266,7 @@
       </w:pPr>
       <w:r>
         <w:pict w14:anchorId="79F631E4">
-          <v:rect id="_x0000_i1398" style="width:0;height:1.5pt" o:hralign="center" o:hrstd="t" o:hr="t" fillcolor="#a0a0a0" stroked="f"/>
+          <v:rect id="_x0000_i1062" style="width:0;height:1.5pt" o:hralign="center" o:hrstd="t" o:hr="t" fillcolor="#a0a0a0" stroked="f"/>
         </w:pict>
       </w:r>
     </w:p>
@@ -9444,7 +9444,7 @@
       </w:pPr>
       <w:r>
         <w:pict w14:anchorId="74E501EB">
-          <v:rect id="_x0000_i1399" style="width:0;height:1.5pt" o:hralign="center" o:hrstd="t" o:hr="t" fillcolor="#a0a0a0" stroked="f"/>
+          <v:rect id="_x0000_i1063" style="width:0;height:1.5pt" o:hralign="center" o:hrstd="t" o:hr="t" fillcolor="#a0a0a0" stroked="f"/>
         </w:pict>
       </w:r>
     </w:p>
@@ -9628,7 +9628,7 @@
       </w:pPr>
       <w:r>
         <w:pict w14:anchorId="10878B96">
-          <v:rect id="_x0000_i1400" style="width:0;height:1.5pt" o:hralign="center" o:hrstd="t" o:hr="t" fillcolor="#a0a0a0" stroked="f"/>
+          <v:rect id="_x0000_i1064" style="width:0;height:1.5pt" o:hralign="center" o:hrstd="t" o:hr="t" fillcolor="#a0a0a0" stroked="f"/>
         </w:pict>
       </w:r>
     </w:p>
@@ -9680,7 +9680,7 @@
       </w:pPr>
       <w:r>
         <w:pict w14:anchorId="3B02ACAB">
-          <v:rect id="_x0000_i1401" style="width:0;height:1.5pt" o:hralign="center" o:hrstd="t" o:hr="t" fillcolor="#a0a0a0" stroked="f"/>
+          <v:rect id="_x0000_i1065" style="width:0;height:1.5pt" o:hralign="center" o:hrstd="t" o:hr="t" fillcolor="#a0a0a0" stroked="f"/>
         </w:pict>
       </w:r>
     </w:p>
@@ -10207,7 +10207,7 @@
       </w:pPr>
       <w:r>
         <w:pict w14:anchorId="70A6F848">
-          <v:rect id="_x0000_i1402" style="width:0;height:1.5pt" o:hralign="center" o:hrstd="t" o:hr="t" fillcolor="#a0a0a0" stroked="f"/>
+          <v:rect id="_x0000_i1066" style="width:0;height:1.5pt" o:hralign="center" o:hrstd="t" o:hr="t" fillcolor="#a0a0a0" stroked="f"/>
         </w:pict>
       </w:r>
     </w:p>
@@ -10901,7 +10901,7 @@
       </w:pPr>
       <w:r>
         <w:pict w14:anchorId="508FCC07">
-          <v:rect id="_x0000_i1403" style="width:0;height:1.5pt" o:hralign="center" o:hrstd="t" o:hr="t" fillcolor="#a0a0a0" stroked="f"/>
+          <v:rect id="_x0000_i1067" style="width:0;height:1.5pt" o:hralign="center" o:hrstd="t" o:hr="t" fillcolor="#a0a0a0" stroked="f"/>
         </w:pict>
       </w:r>
     </w:p>
@@ -11324,7 +11324,7 @@
       </w:pPr>
       <w:r>
         <w:pict w14:anchorId="37931BB5">
-          <v:rect id="_x0000_i1404" style="width:0;height:1.5pt" o:hralign="center" o:hrstd="t" o:hr="t" fillcolor="#a0a0a0" stroked="f"/>
+          <v:rect id="_x0000_i1068" style="width:0;height:1.5pt" o:hralign="center" o:hrstd="t" o:hr="t" fillcolor="#a0a0a0" stroked="f"/>
         </w:pict>
       </w:r>
     </w:p>
@@ -11895,7 +11895,7 @@
       </w:pPr>
       <w:r>
         <w:pict w14:anchorId="219ACF90">
-          <v:rect id="_x0000_i1405" style="width:0;height:1.5pt" o:hralign="center" o:hrstd="t" o:hr="t" fillcolor="#a0a0a0" stroked="f"/>
+          <v:rect id="_x0000_i1069" style="width:0;height:1.5pt" o:hralign="center" o:hrstd="t" o:hr="t" fillcolor="#a0a0a0" stroked="f"/>
         </w:pict>
       </w:r>
     </w:p>
@@ -12157,7 +12157,7 @@
       </w:pPr>
       <w:r>
         <w:pict w14:anchorId="4B1994DD">
-          <v:rect id="_x0000_i1406" style="width:0;height:1.5pt" o:hralign="center" o:hrstd="t" o:hr="t" fillcolor="#a0a0a0" stroked="f"/>
+          <v:rect id="_x0000_i1070" style="width:0;height:1.5pt" o:hralign="center" o:hrstd="t" o:hr="t" fillcolor="#a0a0a0" stroked="f"/>
         </w:pict>
       </w:r>
     </w:p>
@@ -12548,7 +12548,7 @@
       </w:pPr>
       <w:r>
         <w:pict w14:anchorId="2F70BC0D">
-          <v:rect id="_x0000_i1407" style="width:0;height:1.5pt" o:hralign="center" o:hrstd="t" o:hr="t" fillcolor="#a0a0a0" stroked="f"/>
+          <v:rect id="_x0000_i1071" style="width:0;height:1.5pt" o:hralign="center" o:hrstd="t" o:hr="t" fillcolor="#a0a0a0" stroked="f"/>
         </w:pict>
       </w:r>
     </w:p>
@@ -12765,7 +12765,7 @@
       </w:pPr>
       <w:r>
         <w:pict w14:anchorId="12EB096E">
-          <v:rect id="_x0000_i1408" style="width:0;height:1.5pt" o:hralign="center" o:hrstd="t" o:hr="t" fillcolor="#a0a0a0" stroked="f"/>
+          <v:rect id="_x0000_i1072" style="width:0;height:1.5pt" o:hralign="center" o:hrstd="t" o:hr="t" fillcolor="#a0a0a0" stroked="f"/>
         </w:pict>
       </w:r>
     </w:p>
@@ -12818,7 +12818,7 @@
       </w:pPr>
       <w:r>
         <w:pict w14:anchorId="5DD5781B">
-          <v:rect id="_x0000_i1409" style="width:0;height:1.5pt" o:hralign="center" o:hrstd="t" o:hr="t" fillcolor="#a0a0a0" stroked="f"/>
+          <v:rect id="_x0000_i1073" style="width:0;height:1.5pt" o:hralign="center" o:hrstd="t" o:hr="t" fillcolor="#a0a0a0" stroked="f"/>
         </w:pict>
       </w:r>
     </w:p>
@@ -13445,7 +13445,7 @@
       </w:pPr>
       <w:r>
         <w:pict w14:anchorId="616D9805">
-          <v:rect id="_x0000_i1410" style="width:0;height:1.5pt" o:hralign="center" o:hrstd="t" o:hr="t" fillcolor="#a0a0a0" stroked="f"/>
+          <v:rect id="_x0000_i1074" style="width:0;height:1.5pt" o:hralign="center" o:hrstd="t" o:hr="t" fillcolor="#a0a0a0" stroked="f"/>
         </w:pict>
       </w:r>
     </w:p>
@@ -14100,7 +14100,7 @@
       </w:pPr>
       <w:r>
         <w:pict w14:anchorId="446DED74">
-          <v:rect id="_x0000_i1411" style="width:0;height:1.5pt" o:hralign="center" o:hrstd="t" o:hr="t" fillcolor="#a0a0a0" stroked="f"/>
+          <v:rect id="_x0000_i1075" style="width:0;height:1.5pt" o:hralign="center" o:hrstd="t" o:hr="t" fillcolor="#a0a0a0" stroked="f"/>
         </w:pict>
       </w:r>
     </w:p>
@@ -14290,7 +14290,7 @@
       <w:r>
         <w:lastRenderedPageBreak/>
         <w:pict w14:anchorId="483B5BB9">
-          <v:rect id="_x0000_i1412" style="width:0;height:1.5pt" o:hralign="center" o:hrstd="t" o:hr="t" fillcolor="#a0a0a0" stroked="f"/>
+          <v:rect id="_x0000_i1076" style="width:0;height:1.5pt" o:hralign="center" o:hrstd="t" o:hr="t" fillcolor="#a0a0a0" stroked="f"/>
         </w:pict>
       </w:r>
     </w:p>
@@ -14526,7 +14526,7 @@
       </w:pPr>
       <w:r>
         <w:pict w14:anchorId="283AA738">
-          <v:rect id="_x0000_i1413" style="width:0;height:1.5pt" o:hralign="center" o:hrstd="t" o:hr="t" fillcolor="#a0a0a0" stroked="f"/>
+          <v:rect id="_x0000_i1077" style="width:0;height:1.5pt" o:hralign="center" o:hrstd="t" o:hr="t" fillcolor="#a0a0a0" stroked="f"/>
         </w:pict>
       </w:r>
     </w:p>
@@ -14885,7 +14885,7 @@
       </w:pPr>
       <w:r>
         <w:pict w14:anchorId="6D2DCF1B">
-          <v:rect id="_x0000_i1414" style="width:0;height:1.5pt" o:hralign="center" o:hrstd="t" o:hr="t" fillcolor="#a0a0a0" stroked="f"/>
+          <v:rect id="_x0000_i1078" style="width:0;height:1.5pt" o:hralign="center" o:hrstd="t" o:hr="t" fillcolor="#a0a0a0" stroked="f"/>
         </w:pict>
       </w:r>
     </w:p>
@@ -15250,7 +15250,7 @@
       </w:pPr>
       <w:r>
         <w:pict w14:anchorId="116F2EC1">
-          <v:rect id="_x0000_i1415" style="width:0;height:1.5pt" o:hralign="center" o:hrstd="t" o:hr="t" fillcolor="#a0a0a0" stroked="f"/>
+          <v:rect id="_x0000_i1079" style="width:0;height:1.5pt" o:hralign="center" o:hrstd="t" o:hr="t" fillcolor="#a0a0a0" stroked="f"/>
         </w:pict>
       </w:r>
     </w:p>
@@ -15442,7 +15442,7 @@
       </w:pPr>
       <w:r>
         <w:pict w14:anchorId="716163F9">
-          <v:rect id="_x0000_i1416" style="width:0;height:1.5pt" o:hralign="center" o:hrstd="t" o:hr="t" fillcolor="#a0a0a0" stroked="f"/>
+          <v:rect id="_x0000_i1080" style="width:0;height:1.5pt" o:hralign="center" o:hrstd="t" o:hr="t" fillcolor="#a0a0a0" stroked="f"/>
         </w:pict>
       </w:r>
     </w:p>
@@ -24892,6 +24892,7 @@
   <w:style w:type="character" w:default="1" w:styleId="Fontepargpadro">
     <w:name w:val="Default Paragraph Font"/>
     <w:uiPriority w:val="1"/>
+    <w:semiHidden/>
     <w:unhideWhenUsed/>
   </w:style>
   <w:style w:type="table" w:default="1" w:styleId="Tabelanormal">

</xml_diff>